<commit_message>
Add link coverage to fixtures
Co-authored-by: MekDrop <342641+MekDrop@users.noreply.github.com>
</commit_message>
<xml_diff>
--- a/test/fixtures/real-documents/sample.docx
+++ b/test/fixtures/real-documents/sample.docx
@@ -1,6 +1,6 @@
 
 <file path=word/document.xml><?xml version="1.0" encoding="utf-8"?>
-<w:document xmlns:w="http://schemas.openxmlformats.org/wordprocessingml/2006/main">
+<w:document xmlns:w="http://schemas.openxmlformats.org/wordprocessingml/2006/main" xmlns:r="http://schemas.openxmlformats.org/officeDocument/2006/relationships">
   <w:body>
     <w:p>
       <w:r>
@@ -25,6 +25,22 @@
     </w:p>
     <w:p>
       <w:r>
+        <w:t>Example link: </w:t>
+      </w:r>
+      <w:hyperlink r:id="rId1">
+        <w:r>
+          <w:rPr>
+            <w:u w:val="single"/>
+          </w:rPr>
+          <w:t>Example link</w:t>
+        </w:r>
+      </w:hyperlink>
+      <w:r>
+        <w:t xml:space="preserve"> to docs.</w:t>
+      </w:r>
+    </w:p>
+    <w:p>
+      <w:r>
         <w:t>- First list item</w:t>
       </w:r>
     </w:p>

</xml_diff>